<commit_message>
fixed paths in doc
</commit_message>
<xml_diff>
--- a/Dokumentacija.docx
+++ b/Dokumentacija.docx
@@ -356,7 +356,7 @@
                 <w:szCs w:val="16"/>
               </w:rPr>
             </w:pPr>
-            <w:hyperlink r:id="R211d5bbe598e43a1">
+            <w:hyperlink r:id="R4a1755f727b84277">
               <w:r>
                 <w:rPr>
                   <w:rStyle w:val="Hyperlink"/>
@@ -7235,7 +7235,7 @@
       </w:r>
       <w:bookmarkEnd w:id="246335196"/>
     </w:p>
-    <w:p xmlns:wp14="http://schemas.microsoft.com/office/word/2010/wordml" wp14:textId="77777777">
+    <w:p xmlns:wp14="http://schemas.microsoft.com/office/word/2010/wordml" wp14:textId="3BB29AC5">
       <w:pPr>
         <w:pStyle w:val="SourceCode"/>
       </w:pPr>
@@ -7243,7 +7243,19 @@
         <w:rPr>
           <w:rStyle w:val="VerbatimChar"/>
         </w:rPr>
-        <w:t xml:space="preserve">Upotreba: konkurentno_template [OPCIJE] &lt;seed-url&gt; [seed-url2 ...]</w:t>
+        <w:t xml:space="preserve">Upotreba: </w:t>
+      </w:r>
+      <w:r>
+        <w:rPr>
+          <w:rStyle w:val="VerbatimChar"/>
+        </w:rPr>
+        <w:t>web-crawler</w:t>
+      </w:r>
+      <w:r>
+        <w:rPr>
+          <w:rStyle w:val="VerbatimChar"/>
+        </w:rPr>
+        <w:t xml:space="preserve"> [OPCIJE] &lt;seed-url&gt; [seed-url2 ...]</w:t>
       </w:r>
       <w:r>
         <w:br/>
@@ -7324,7 +7336,7 @@
       </w:r>
       <w:bookmarkEnd w:id="1215278370"/>
     </w:p>
-    <w:p xmlns:wp14="http://schemas.microsoft.com/office/word/2010/wordml" wp14:textId="77777777">
+    <w:p xmlns:wp14="http://schemas.microsoft.com/office/word/2010/wordml" wp14:textId="2A86EAB6">
       <w:pPr>
         <w:pStyle w:val="SourceCode"/>
       </w:pPr>
@@ -7332,115 +7344,127 @@
         <w:rPr>
           <w:rStyle w:val="VerbatimChar"/>
         </w:rPr>
-        <w:t xml:space="preserve">$ ./out/Release/konkurentno_template -t 6 -d 2 -p 20 -v https://example.com</w:t>
-      </w:r>
-      <w:r>
-        <w:br/>
-      </w:r>
-      <w:r>
-        <w:rPr>
-          <w:rStyle w:val="VerbatimChar"/>
-        </w:rPr>
-        <w:t xml:space="preserve">Pokrecem crawl sa 6 thread-ova, max-depth=2, max-pages=20 ...</w:t>
-      </w:r>
-      <w:r>
-        <w:br/>
-      </w:r>
-      <w:r>
-        <w:rPr>
-          <w:rStyle w:val="VerbatimChar"/>
-        </w:rPr>
-        <w:t xml:space="preserve">[depth=0] [200] https://example.com</w:t>
-      </w:r>
-      <w:r>
-        <w:br/>
-      </w:r>
-      <w:r>
-        <w:rPr>
-          <w:rStyle w:val="VerbatimChar"/>
-        </w:rPr>
-        <w:t xml:space="preserve">[depth=1] [200] https://iana.org/domains/example</w:t>
-      </w:r>
-      <w:r>
-        <w:br/>
-      </w:r>
-      <w:r>
-        <w:rPr>
-          <w:rStyle w:val="VerbatimChar"/>
-        </w:rPr>
-        <w:t xml:space="preserve">[depth=2] [200] https://iana.org/domains</w:t>
-      </w:r>
-      <w:r>
-        <w:br/>
-      </w:r>
-      <w:r>
-        <w:rPr>
-          <w:rStyle w:val="VerbatimChar"/>
-        </w:rPr>
-        <w:t xml:space="preserve">[depth=2] [200] https://iana.org/numbers</w:t>
-      </w:r>
-      <w:r>
-        <w:br/>
-      </w:r>
-      <w:r>
-        <w:rPr>
-          <w:rStyle w:val="VerbatimChar"/>
-        </w:rPr>
-        <w:t xml:space="preserve">...</w:t>
-      </w:r>
-      <w:r>
-        <w:br/>
-      </w:r>
-      <w:r>
-        <w:rPr>
-          <w:rStyle w:val="VerbatimChar"/>
-        </w:rPr>
-        <w:t xml:space="preserve">=== Rezultat ===</w:t>
-      </w:r>
-      <w:r>
-        <w:br/>
-      </w:r>
-      <w:r>
-        <w:rPr>
-          <w:rStyle w:val="VerbatimChar"/>
-        </w:rPr>
-        <w:t xml:space="preserve">Preuzeto stranica (uspesno):  25</w:t>
-      </w:r>
-      <w:r>
-        <w:br/>
-      </w:r>
-      <w:r>
-        <w:rPr>
-          <w:rStyle w:val="VerbatimChar"/>
-        </w:rPr>
-        <w:t xml:space="preserve">Neuspesnih preuzimanja:       0</w:t>
-      </w:r>
-      <w:r>
-        <w:br/>
-      </w:r>
-      <w:r>
-        <w:rPr>
-          <w:rStyle w:val="VerbatimChar"/>
-        </w:rPr>
-        <w:t xml:space="preserve">Otkriveno novih linkova:      26</w:t>
-      </w:r>
-      <w:r>
-        <w:br/>
-      </w:r>
-      <w:r>
-        <w:rPr>
-          <w:rStyle w:val="VerbatimChar"/>
-        </w:rPr>
-        <w:t xml:space="preserve">Ukupno jedinstvenih URL-ova:  27</w:t>
-      </w:r>
-      <w:r>
-        <w:br/>
-      </w:r>
-      <w:r>
-        <w:rPr>
-          <w:rStyle w:val="VerbatimChar"/>
-        </w:rPr>
-        <w:t xml:space="preserve">Vreme izvrsavanja:            4.35 s</w:t>
+        <w:t>$ ./out/Release/</w:t>
+      </w:r>
+      <w:r>
+        <w:rPr>
+          <w:rStyle w:val="VerbatimChar"/>
+        </w:rPr>
+        <w:t>web-crawler</w:t>
+      </w:r>
+      <w:r>
+        <w:rPr>
+          <w:rStyle w:val="VerbatimChar"/>
+        </w:rPr>
+        <w:t xml:space="preserve"> -t 6 -d 2 -p 20 -v https://example.com</w:t>
+      </w:r>
+      <w:r>
+        <w:br/>
+      </w:r>
+      <w:r>
+        <w:rPr>
+          <w:rStyle w:val="VerbatimChar"/>
+        </w:rPr>
+        <w:t>Pokrecem crawl sa 6 thread-ova, max-depth=2, max-pages=20 ...</w:t>
+      </w:r>
+      <w:r>
+        <w:br/>
+      </w:r>
+      <w:r>
+        <w:rPr>
+          <w:rStyle w:val="VerbatimChar"/>
+        </w:rPr>
+        <w:t>[depth=0] [200] https://example.com</w:t>
+      </w:r>
+      <w:r>
+        <w:br/>
+      </w:r>
+      <w:r>
+        <w:rPr>
+          <w:rStyle w:val="VerbatimChar"/>
+        </w:rPr>
+        <w:t>[depth=1] [200] https://iana.org/domains/example</w:t>
+      </w:r>
+      <w:r>
+        <w:br/>
+      </w:r>
+      <w:r>
+        <w:rPr>
+          <w:rStyle w:val="VerbatimChar"/>
+        </w:rPr>
+        <w:t>[depth=2] [200] https://iana.org/domains</w:t>
+      </w:r>
+      <w:r>
+        <w:br/>
+      </w:r>
+      <w:r>
+        <w:rPr>
+          <w:rStyle w:val="VerbatimChar"/>
+        </w:rPr>
+        <w:t>[depth=2] [200] https://iana.org/numbers</w:t>
+      </w:r>
+      <w:r>
+        <w:br/>
+      </w:r>
+      <w:r>
+        <w:rPr>
+          <w:rStyle w:val="VerbatimChar"/>
+        </w:rPr>
+        <w:t>...</w:t>
+      </w:r>
+      <w:r>
+        <w:br/>
+      </w:r>
+      <w:r>
+        <w:rPr>
+          <w:rStyle w:val="VerbatimChar"/>
+        </w:rPr>
+        <w:t>=== Rezultat ===</w:t>
+      </w:r>
+      <w:r>
+        <w:br/>
+      </w:r>
+      <w:r>
+        <w:rPr>
+          <w:rStyle w:val="VerbatimChar"/>
+        </w:rPr>
+        <w:t>Preuzeto stranica (uspesno):  25</w:t>
+      </w:r>
+      <w:r>
+        <w:br/>
+      </w:r>
+      <w:r>
+        <w:rPr>
+          <w:rStyle w:val="VerbatimChar"/>
+        </w:rPr>
+        <w:t>Neuspesnih preuzimanja:       0</w:t>
+      </w:r>
+      <w:r>
+        <w:br/>
+      </w:r>
+      <w:r>
+        <w:rPr>
+          <w:rStyle w:val="VerbatimChar"/>
+        </w:rPr>
+        <w:t>Otkriveno novih linkova:      26</w:t>
+      </w:r>
+      <w:r>
+        <w:br/>
+      </w:r>
+      <w:r>
+        <w:rPr>
+          <w:rStyle w:val="VerbatimChar"/>
+        </w:rPr>
+        <w:t>Ukupno jedinstvenih URL-ova:  27</w:t>
+      </w:r>
+      <w:r>
+        <w:br/>
+      </w:r>
+      <w:r>
+        <w:rPr>
+          <w:rStyle w:val="VerbatimChar"/>
+        </w:rPr>
+        <w:t>Vreme izvrsavanja:            4.35 s</w:t>
       </w:r>
     </w:p>
     <w:p xmlns:wp14="http://schemas.microsoft.com/office/word/2010/wordml" wp14:textId="77777777">
@@ -7797,27 +7821,30 @@
         <w:t xml:space="preserve">Pokretanje:</w:t>
       </w:r>
     </w:p>
-    <w:p xmlns:wp14="http://schemas.microsoft.com/office/word/2010/wordml" wp14:textId="77777777">
+    <w:p xmlns:wp14="http://schemas.microsoft.com/office/word/2010/wordml" wp14:textId="1E6ECDC5">
       <w:pPr>
         <w:pStyle w:val="SourceCode"/>
       </w:pPr>
       <w:r>
         <w:rPr>
           <w:rStyle w:val="ExtensionTok"/>
-        </w:rPr>
-        <w:t xml:space="preserve">./build</w:t>
-      </w:r>
-      <w:r>
-        <w:rPr>
-          <w:rStyle w:val="NormalTok"/>
+          <w:lang w:val="en-US"/>
+        </w:rPr>
+        <w:t>./build</w:t>
+      </w:r>
+      <w:r>
+        <w:rPr>
+          <w:rStyle w:val="NormalTok"/>
+          <w:lang w:val="en-US"/>
         </w:rPr>
         <w:t xml:space="preserve"> </w:t>
       </w:r>
       <w:r>
         <w:rPr>
           <w:rStyle w:val="AttributeTok"/>
-        </w:rPr>
-        <w:t xml:space="preserve">--debug</w:t>
+          <w:lang w:val="en-US"/>
+        </w:rPr>
+        <w:t>--debug</w:t>
       </w:r>
       <w:r>
         <w:br/>
@@ -7825,20 +7852,37 @@
       <w:r>
         <w:rPr>
           <w:rStyle w:val="ExtensionTok"/>
-        </w:rPr>
-        <w:t xml:space="preserve">./out/Debug/konkurentno_template_tests</w:t>
-      </w:r>
-      <w:r>
-        <w:rPr>
-          <w:rStyle w:val="NormalTok"/>
+          <w:lang w:val="en-US"/>
+        </w:rPr>
+        <w:t>./out/Debug/</w:t>
+      </w:r>
+      <w:r>
+        <w:rPr>
+          <w:rStyle w:val="ExtensionTok"/>
+          <w:lang w:val="en-US"/>
+        </w:rPr>
+        <w:t>web-crawler-</w:t>
+      </w:r>
+      <w:r>
+        <w:rPr>
+          <w:rStyle w:val="ExtensionTok"/>
+          <w:lang w:val="en-US"/>
+        </w:rPr>
+        <w:t>tests</w:t>
+      </w:r>
+      <w:r>
+        <w:rPr>
+          <w:rStyle w:val="NormalTok"/>
+          <w:lang w:val="en-US"/>
         </w:rPr>
         <w:t xml:space="preserve"> </w:t>
       </w:r>
       <w:r>
         <w:rPr>
           <w:rStyle w:val="AttributeTok"/>
-        </w:rPr>
-        <w:t xml:space="preserve">--verbose</w:t>
+          <w:lang w:val="en-US"/>
+        </w:rPr>
+        <w:t>--verbose</w:t>
       </w:r>
     </w:p>
     <w:p xmlns:wp14="http://schemas.microsoft.com/office/word/2010/wordml" wp14:textId="77777777">
@@ -8014,16 +8058,18 @@
       </w:pPr>
       <w:r>
         <w:rPr>
-          <w:b/>
-          <w:bCs/>
-        </w:rPr>
-        <w:t xml:space="preserve">Trenutna ograničenja</w:t>
-      </w:r>
-      <w:r>
-        <w:t xml:space="preserve"> </w:t>
-      </w:r>
-      <w:r>
-        <w:t xml:space="preserve">(svesno prihvaćena zbog fokusa na konkurentnost):</w:t>
+          <w:b w:val="1"/>
+          <w:bCs w:val="1"/>
+        </w:rPr>
+        <w:t>Trenutna ograničenja</w:t>
+      </w:r>
+      <w:r>
+        <w:rPr/>
+        <w:t xml:space="preserve"> </w:t>
+      </w:r>
+      <w:r>
+        <w:rPr/>
+        <w:t>(svesno prihvaćena zbog fokusa na konkurentnost):</w:t>
       </w:r>
     </w:p>
     <w:p xmlns:wp14="http://schemas.microsoft.com/office/word/2010/wordml" wp14:textId="77777777">
@@ -8035,19 +8081,7 @@
         </w:numPr>
       </w:pPr>
       <w:r>
-        <w:t xml:space="preserve">ne poštuje se</w:t>
-      </w:r>
-      <w:r>
-        <w:t xml:space="preserve"> </w:t>
-      </w:r>
-      <w:r>
-        <w:rPr>
-          <w:rStyle w:val="VerbatimChar"/>
-        </w:rPr>
-        <w:t xml:space="preserve">robots.txt</w:t>
-      </w:r>
-      <w:r>
-        <w:t xml:space="preserve">,</w:t>
+        <w:t xml:space="preserve">parser linkova je pojednostavljen (nije pun HTML/DOM parser),</w:t>
       </w:r>
     </w:p>
     <w:p xmlns:wp14="http://schemas.microsoft.com/office/word/2010/wordml" wp14:textId="77777777">
@@ -8059,7 +8093,13 @@
         </w:numPr>
       </w:pPr>
       <w:r>
-        <w:t xml:space="preserve">parser linkova je pojednostavljen (nije pun HTML/DOM parser),</w:t>
+        <w:t xml:space="preserve">skup posećenih stranica postoji samo u memoriji procesa (bez</w:t>
+      </w:r>
+      <w:r>
+        <w:t xml:space="preserve"> </w:t>
+      </w:r>
+      <w:r>
+        <w:t xml:space="preserve">perzistencije/nastavka između pokretanja),</w:t>
       </w:r>
     </w:p>
     <w:p xmlns:wp14="http://schemas.microsoft.com/office/word/2010/wordml" wp14:textId="77777777">
@@ -8071,24 +8111,6 @@
         </w:numPr>
       </w:pPr>
       <w:r>
-        <w:t xml:space="preserve">skup posećenih stranica postoji samo u memoriji procesa (bez</w:t>
-      </w:r>
-      <w:r>
-        <w:t xml:space="preserve"> </w:t>
-      </w:r>
-      <w:r>
-        <w:t xml:space="preserve">perzistencije/nastavka između pokretanja),</w:t>
-      </w:r>
-    </w:p>
-    <w:p xmlns:wp14="http://schemas.microsoft.com/office/word/2010/wordml" wp14:textId="77777777">
-      <w:pPr>
-        <w:pStyle w:val="Compact"/>
-        <w:numPr>
-          <w:ilvl w:val="0"/>
-          <w:numId w:val="1009"/>
-        </w:numPr>
-      </w:pPr>
-      <w:r>
         <w:t xml:space="preserve">nema ograničenja broja paralelnih zahteva ka</w:t>
       </w:r>
       <w:r>
@@ -8133,39 +8155,19 @@
           <w:ilvl w:val="0"/>
           <w:numId w:val="1010"/>
         </w:numPr>
-      </w:pPr>
-      <w:r>
-        <w:t xml:space="preserve">rate-limiting po domenu (npr. deljena mapa domen → poslednje vreme</w:t>
-      </w:r>
-      <w:r>
-        <w:t xml:space="preserve"> </w:t>
-      </w:r>
-      <w:r>
-        <w:t xml:space="preserve">zahteva, sa dodatnim mutex-om),</w:t>
-      </w:r>
-    </w:p>
-    <w:p xmlns:wp14="http://schemas.microsoft.com/office/word/2010/wordml" wp14:textId="77777777">
-      <w:pPr>
-        <w:pStyle w:val="Compact"/>
-        <w:numPr>
-          <w:ilvl w:val="0"/>
-          <w:numId w:val="1010"/>
-        </w:numPr>
-      </w:pPr>
-      <w:r>
-        <w:t xml:space="preserve">podrška za</w:t>
-      </w:r>
-      <w:r>
-        <w:t xml:space="preserve"> </w:t>
-      </w:r>
-      <w:r>
-        <w:rPr>
-          <w:rStyle w:val="VerbatimChar"/>
-        </w:rPr>
-        <w:t xml:space="preserve">robots.txt</w:t>
-      </w:r>
-      <w:r>
-        <w:t xml:space="preserve">,</w:t>
+        <w:rPr/>
+      </w:pPr>
+      <w:r>
+        <w:rPr/>
+        <w:t>rate-limiting po domenu (npr. deljena mapa domen → poslednje vreme</w:t>
+      </w:r>
+      <w:r>
+        <w:rPr/>
+        <w:t xml:space="preserve"> </w:t>
+      </w:r>
+      <w:r>
+        <w:rPr/>
+        <w:t>zahteva, sa dodatnim mutex-om),</w:t>
       </w:r>
     </w:p>
     <w:p xmlns:wp14="http://schemas.microsoft.com/office/word/2010/wordml" wp14:textId="77777777">
@@ -8303,10 +8305,10 @@
       <w:pgSz w:w="12240" w:h="15840" w:orient="portrait"/>
       <w:cols w:num="1"/>
       <w:titlePg w:val="1"/>
-      <w:headerReference w:type="default" r:id="R7bb0f862ce2244f9"/>
-      <w:headerReference w:type="first" r:id="R8c24c16e3016485e"/>
-      <w:footerReference w:type="default" r:id="R2c5f5c608db94436"/>
-      <w:footerReference w:type="first" r:id="R0501742f98a34a3b"/>
+      <w:headerReference w:type="default" r:id="Rf2f788cce6d04d85"/>
+      <w:headerReference w:type="first" r:id="R0056803918774ebd"/>
+      <w:footerReference w:type="default" r:id="R20d22dfc134e4587"/>
+      <w:footerReference w:type="first" r:id="Rf7d47e62abfd4bae"/>
     </w:sectPr>
   </w:body>
 </w:document>
@@ -9717,7 +9719,7 @@
     <w:basedOn w:val="Normal"/>
     <w:next w:val="Normal"/>
     <w:unhideWhenUsed/>
-    <w:rsid w:val="7230E233"/>
+    <w:rsid w:val="3CE818EE"/>
     <w:pPr>
       <w:spacing w:after="100"/>
     </w:pPr>
@@ -9728,7 +9730,7 @@
     <w:basedOn w:val="Normal"/>
     <w:next w:val="Normal"/>
     <w:unhideWhenUsed/>
-    <w:rsid w:val="7230E233"/>
+    <w:rsid w:val="3CE818EE"/>
     <w:pPr>
       <w:spacing w:after="100"/>
       <w:ind w:left="220"/>
@@ -9740,7 +9742,7 @@
     <w:basedOn w:val="Normal"/>
     <w:next w:val="Normal"/>
     <w:unhideWhenUsed/>
-    <w:rsid w:val="7230E233"/>
+    <w:rsid w:val="3CE818EE"/>
     <w:pPr>
       <w:spacing w:after="100"/>
       <w:ind w:left="440"/>
@@ -9751,7 +9753,7 @@
     <w:name w:val="header"/>
     <w:basedOn w:val="Normal"/>
     <w:unhideWhenUsed/>
-    <w:rsid w:val="7230E233"/>
+    <w:rsid w:val="3CE818EE"/>
     <w:pPr>
       <w:tabs>
         <w:tab w:val="center" w:leader="none" w:pos="4680"/>
@@ -9765,7 +9767,7 @@
     <w:name w:val="footer"/>
     <w:basedOn w:val="Normal"/>
     <w:unhideWhenUsed/>
-    <w:rsid w:val="7230E233"/>
+    <w:rsid w:val="3CE818EE"/>
     <w:pPr>
       <w:tabs>
         <w:tab w:val="center" w:leader="none" w:pos="4680"/>

</xml_diff>